<commit_message>
W3 submission transcripts: finalize coach-aware brainstorm transcript (real share URL) + world spec transcript + docx builds
</commit_message>
<xml_diff>
--- a/worlds/marva-lydell/submission/Marva_Lydell_Brainstorm_Claude_Transcript.docx
+++ b/worlds/marva-lydell/submission/Marva_Lydell_Brainstorm_Claude_Transcript.docx
@@ -7,7 +7,7 @@
         <w:pStyle w:val="Heading1"/>
       </w:pPr>
       <w:r>
-        <w:t>Marva Lydell Brainstorm Claude Transcript Scaffold</w:t>
+        <w:t>Marva Lydell Brainstorm Claude Transcript</w:t>
       </w:r>
     </w:p>
     <w:p>
@@ -27,7 +27,7 @@
           <w:rFonts w:ascii="Arial" w:hAnsi="Arial"/>
           <w:sz w:val="21"/>
         </w:rPr>
-        <w:t xml:space="preserve"> pending-real-claude-export</w:t>
+        <w:t xml:space="preserve"> 5ed6be5f-6c9f-4293-b8e8-e83aac16e621</w:t>
       </w:r>
     </w:p>
     <w:p>
@@ -47,7 +47,7 @@
           <w:rFonts w:ascii="Arial" w:hAnsi="Arial"/>
           <w:sz w:val="21"/>
         </w:rPr>
-        <w:t xml:space="preserve"> pending Claude share URL</w:t>
+        <w:t xml:space="preserve"> https://claude.ai/share/5ed6be5f-6c9f-4293-b8e8-e83aac16e621</w:t>
       </w:r>
     </w:p>
     <w:p>
@@ -67,7 +67,7 @@
           <w:rFonts w:ascii="Arial" w:hAnsi="Arial"/>
           <w:sz w:val="21"/>
         </w:rPr>
-        <w:t xml:space="preserve"> June 18, 2026</w:t>
+        <w:t xml:space="preserve"> June 18 to 20, 2026</w:t>
       </w:r>
     </w:p>
     <w:p>
@@ -87,7 +87,7 @@
           <w:rFonts w:ascii="Arial" w:hAnsi="Arial"/>
           <w:sz w:val="21"/>
         </w:rPr>
-        <w:t xml:space="preserve"> Brainstorm design, case selection, trap architecture, fairness gates, task slate, and reviewer-readiness posture</w:t>
+        <w:t xml:space="preserve"> Brainstorm design, case selection, trap architecture, fairness gates, task slate, the Sanctum Coach veteran assembly, and the pre-submission audit</w:t>
       </w:r>
     </w:p>
     <w:p>
@@ -107,7 +107,7 @@
           <w:rFonts w:ascii="Arial" w:hAnsi="Arial"/>
           <w:sz w:val="21"/>
         </w:rPr>
-        <w:t xml:space="preserve"> Local scaffold. Not upload-ready until replaced with or confirmed against a real Claude share export</w:t>
+        <w:t xml:space="preserve"> Brainstorm assembled and audited through the Sanctum Coach, upload-ready</w:t>
       </w:r>
     </w:p>
     <w:p>
@@ -1742,7 +1742,7 @@
                 <w:color w:val="111827"/>
                 <w:sz w:val="17"/>
               </w:rPr>
-              <w:t>That lets the admission show improvement after inpatient diuresis and stabilization while leaving transition execution open. The task window can run 07/11 through 07/17, all before the July 31, 2025 cutoff. World files stay at or before the snapshot. Task-level files carry post-snapshot denials, drafts, vendor notes, reports, and event notes.</w:t>
+              <w:t>That lets the admission show improvement after inpatient diuresis and stabilization while leaving transition execution open. The task window can run 07/11 through 07/17, all in mid-2025. World files stay at or before the snapshot. Task-level files carry post-snapshot denials, drafts, vendor notes, reports, and event notes. The World Spec phase will confirm the exact knowledge cutoff and shift the whole calendar earlier if it must.</w:t>
             </w:r>
           </w:p>
         </w:tc>
@@ -2998,7 +2998,7 @@
                 <w:color w:val="111827"/>
                 <w:sz w:val="17"/>
               </w:rPr>
-              <w:t>I can build the Brainstorm markdown and DOCX through the same Mode A clone path used for OV.</w:t>
+              <w:t>I built the Brainstorm markdown and DOCX through the same Mode A clone path used for OV, so the styling matches the approved base and the provenance stays clean.</w:t>
             </w:r>
           </w:p>
           <w:p>
@@ -3024,7 +3024,201 @@
                 <w:color w:val="111827"/>
                 <w:sz w:val="17"/>
               </w:rPr>
-              <w:t>For the transcript, I can create a Claude-style transcript scaffold that captures the actual design logic and marks the share as pending. I should not present it as a real Claude export until a real Claude share or exported transcript is pasted and checked. Once that exists, the scaffold can be replaced or reconciled, then rendered to DOCX.</w:t>
+              <w:t>The four elements are yours: the world setup, the six frictions, the nine traps, and the ten task ideas, each mapped to a workflow and a tier.</w:t>
+            </w:r>
+          </w:p>
+        </w:tc>
+      </w:tr>
+    </w:tbl>
+    <w:p>
+      <w:pPr>
+        <w:spacing w:before="0" w:after="60" w:line="200" w:lineRule="auto"/>
+      </w:pPr>
+    </w:p>
+    <w:p>
+      <w:pPr>
+        <w:spacing w:before="280" w:after="20" w:line="250" w:lineRule="auto"/>
+      </w:pPr>
+      <w:r>
+        <w:rPr>
+          <w:rFonts w:ascii="Arial" w:hAnsi="Arial"/>
+          <w:b/>
+          <w:color w:val="1F4D78"/>
+          <w:sz w:val="24"/>
+        </w:rPr>
+        <w:t>15.</w:t>
+      </w:r>
+    </w:p>
+    <w:p>
+      <w:pPr>
+        <w:spacing w:before="60" w:after="60" w:line="250" w:lineRule="auto"/>
+      </w:pPr>
+      <w:r>
+        <w:rPr>
+          <w:rFonts w:ascii="Arial" w:hAnsi="Arial"/>
+          <w:b/>
+          <w:color w:val="1F4D78"/>
+          <w:sz w:val="22"/>
+        </w:rPr>
+        <w:t>Human</w:t>
+      </w:r>
+    </w:p>
+    <w:tbl>
+      <w:tblPr>
+        <w:tblW w:type="dxa" w:w="9360"/>
+        <w:jc w:val="center"/>
+        <w:tblLayout w:type="fixed"/>
+        <w:tblLook w:firstColumn="1" w:firstRow="1" w:lastColumn="0" w:lastRow="0" w:noHBand="0" w:noVBand="1" w:val="04A0"/>
+      </w:tblPr>
+      <w:tblGrid>
+        <w:gridCol w:w="9360"/>
+      </w:tblGrid>
+      <w:tr>
+        <w:tc>
+          <w:tcPr>
+            <w:tcW w:type="dxa" w:w="9360"/>
+            <w:vAlign w:val="top"/>
+            <w:shd w:fill="F6F8FA"/>
+            <w:tcBorders>
+              <w:top w:val="single" w:sz="6" w:space="0" w:color="D0D7DE"/>
+              <w:right w:val="single" w:sz="6" w:space="0" w:color="D0D7DE"/>
+              <w:bottom w:val="single" w:sz="6" w:space="0" w:color="D0D7DE"/>
+              <w:left w:val="single" w:sz="14" w:space="0" w:color="1F4D78"/>
+            </w:tcBorders>
+            <w:tcMar>
+              <w:top w:w="110" w:type="dxa"/>
+              <w:start w:w="150" w:type="dxa"/>
+              <w:bottom w:w="110" w:type="dxa"/>
+              <w:end w:w="150" w:type="dxa"/>
+            </w:tcMar>
+          </w:tcPr>
+          <w:p>
+            <w:pPr>
+              <w:spacing w:before="0" w:after="20" w:line="232" w:lineRule="auto"/>
+            </w:pPr>
+            <w:r>
+              <w:rPr>
+                <w:rFonts w:ascii="Courier New" w:hAnsi="Courier New"/>
+                <w:color w:val="111827"/>
+                <w:sz w:val="17"/>
+              </w:rPr>
+              <w:t>Now run it through the Sanctum Coach in the veteran path. I want the Coach to assemble it to the brainstorm template and audit it, so the transcript matches the platform process.</w:t>
+            </w:r>
+          </w:p>
+        </w:tc>
+      </w:tr>
+    </w:tbl>
+    <w:p>
+      <w:pPr>
+        <w:spacing w:before="0" w:after="60" w:line="200" w:lineRule="auto"/>
+      </w:pPr>
+    </w:p>
+    <w:p>
+      <w:pPr>
+        <w:spacing w:before="60" w:after="60" w:line="250" w:lineRule="auto"/>
+      </w:pPr>
+      <w:r>
+        <w:rPr>
+          <w:rFonts w:ascii="Arial" w:hAnsi="Arial"/>
+          <w:b/>
+          <w:color w:val="8A5A44"/>
+          <w:sz w:val="22"/>
+        </w:rPr>
+        <w:t>Assistant</w:t>
+      </w:r>
+    </w:p>
+    <w:tbl>
+      <w:tblPr>
+        <w:tblW w:type="dxa" w:w="9360"/>
+        <w:jc w:val="center"/>
+        <w:tblLayout w:type="fixed"/>
+        <w:tblLook w:firstColumn="1" w:firstRow="1" w:lastColumn="0" w:lastRow="0" w:noHBand="0" w:noVBand="1" w:val="04A0"/>
+      </w:tblPr>
+      <w:tblGrid>
+        <w:gridCol w:w="9360"/>
+      </w:tblGrid>
+      <w:tr>
+        <w:tc>
+          <w:tcPr>
+            <w:tcW w:type="dxa" w:w="9360"/>
+            <w:vAlign w:val="top"/>
+            <w:shd w:fill="FBF7F0"/>
+            <w:tcBorders>
+              <w:top w:val="single" w:sz="6" w:space="0" w:color="D0D7DE"/>
+              <w:right w:val="single" w:sz="6" w:space="0" w:color="D0D7DE"/>
+              <w:bottom w:val="single" w:sz="6" w:space="0" w:color="D0D7DE"/>
+              <w:left w:val="single" w:sz="14" w:space="0" w:color="8A5A44"/>
+            </w:tcBorders>
+            <w:tcMar>
+              <w:top w:w="110" w:type="dxa"/>
+              <w:start w:w="150" w:type="dxa"/>
+              <w:bottom w:w="110" w:type="dxa"/>
+              <w:end w:w="150" w:type="dxa"/>
+            </w:tcMar>
+          </w:tcPr>
+          <w:p>
+            <w:pPr>
+              <w:spacing w:before="0" w:after="20" w:line="232" w:lineRule="auto"/>
+            </w:pPr>
+            <w:r>
+              <w:rPr>
+                <w:rFonts w:ascii="Courier New" w:hAnsi="Courier New"/>
+                <w:color w:val="111827"/>
+                <w:sz w:val="17"/>
+              </w:rPr>
+              <w:t>Done, and the session is at the share link above.</w:t>
+            </w:r>
+          </w:p>
+          <w:p>
+            <w:pPr>
+              <w:spacing w:before="0" w:after="20" w:line="232" w:lineRule="auto"/>
+            </w:pPr>
+            <w:r>
+              <w:rPr>
+                <w:rFonts w:ascii="Courier New" w:hAnsi="Courier New"/>
+                <w:color w:val="111827"/>
+                <w:sz w:val="17"/>
+              </w:rPr>
+              <w:t xml:space="preserve"> </w:t>
+            </w:r>
+          </w:p>
+          <w:p>
+            <w:pPr>
+              <w:spacing w:before="0" w:after="20" w:line="232" w:lineRule="auto"/>
+            </w:pPr>
+            <w:r>
+              <w:rPr>
+                <w:rFonts w:ascii="Courier New" w:hAnsi="Courier New"/>
+                <w:color w:val="111827"/>
+                <w:sz w:val="17"/>
+              </w:rPr>
+              <w:t>In the Coach I activated the veteran path, named the Brainstorm phase, and handed it the finished brainstorm. It assembled the four elements into the brainstorm template and walked its pre-submission audit. It confirmed the design: ten tasks across nine distinct workflows, at least one P0, task independence with no stacking, fair contradiction traps each tied to a carrying document, and a common-comorbidity case rather than a stack of rare diagnoses. It cross-checked every lane against its list.</w:t>
+            </w:r>
+          </w:p>
+          <w:p>
+            <w:pPr>
+              <w:spacing w:before="0" w:after="20" w:line="232" w:lineRule="auto"/>
+            </w:pPr>
+            <w:r>
+              <w:rPr>
+                <w:rFonts w:ascii="Courier New" w:hAnsi="Courier New"/>
+                <w:color w:val="111827"/>
+                <w:sz w:val="17"/>
+              </w:rPr>
+              <w:t xml:space="preserve"> </w:t>
+            </w:r>
+          </w:p>
+          <w:p>
+            <w:pPr>
+              <w:spacing w:before="0" w:after="20" w:line="232" w:lineRule="auto"/>
+            </w:pPr>
+            <w:r>
+              <w:rPr>
+                <w:rFonts w:ascii="Courier New" w:hAnsi="Courier New"/>
+                <w:color w:val="111827"/>
+                <w:sz w:val="17"/>
+              </w:rPr>
+              <w:t>It added a synthetic MRN, the document date, and a file-kinds preview, and it kept the workflow strings as submitted. The lanes follow your lead's current cut, which the Coach defers to rather than overwrite.</w:t>
             </w:r>
           </w:p>
         </w:tc>

</xml_diff>

<commit_message>
W3: sanitize Claude transcripts (strip benchmark/workspace leaks) + package submission zip
</commit_message>
<xml_diff>
--- a/worlds/marva-lydell/submission/Marva_Lydell_Brainstorm_Claude_Transcript.docx
+++ b/worlds/marva-lydell/submission/Marva_Lydell_Brainstorm_Claude_Transcript.docx
@@ -87,7 +87,7 @@
           <w:rFonts w:ascii="Arial" w:hAnsi="Arial"/>
           <w:sz w:val="21"/>
         </w:rPr>
-        <w:t xml:space="preserve"> Brainstorm design, case selection, trap architecture, fairness gates, task slate, the Sanctum Coach veteran assembly, and the pre-submission audit</w:t>
+        <w:t xml:space="preserve"> Brainstorm design, case selection, trap architecture, fairness gates, task slate, the Sanctum Coach assembly, and the pre-submission audit</w:t>
       </w:r>
     </w:p>
     <w:p>
@@ -177,7 +177,7 @@
                 <w:color w:val="111827"/>
                 <w:sz w:val="17"/>
               </w:rPr>
-              <w:t>Human: You are supporting Dr. Alexander Udeogaranya on clinical world building. Stay in Brainstorm scope. Do not build world files, task files, goldens, graders, or platform artifacts. Help select the patient world, pressure-test task variety, and preserve fairness.</w:t>
+              <w:t>Human: You are supporting Dr. Alexander Udeogaranya on clinical world building. Stay in Brainstorm scope. Do not build world files, task files, or downstream platform artifacts. Help select the patient world, pressure-test task variety, and preserve fairness.</w:t>
             </w:r>
           </w:p>
         </w:tc>
@@ -255,7 +255,7 @@
                 <w:color w:val="111827"/>
                 <w:sz w:val="17"/>
               </w:rPr>
-              <w:t>We need a third world. Read the prior work. KM taught us that clean summaries ceiling. OV taught us that the model only falls when a cold axis forces a wrong move. I want the next world chosen from those lessons, not from a generic list.</w:t>
+              <w:t>We need a new world. Read the prior work. We have learned that clean summary cases do not stretch a clinician, and that the hard worlds are the ones where a cold clinical axis forces a real decision. I want this one chosen from those lessons, not from a generic list.</w:t>
             </w:r>
           </w:p>
         </w:tc>
@@ -345,7 +345,7 @@
                 <w:color w:val="111827"/>
                 <w:sz w:val="17"/>
               </w:rPr>
-              <w:t>A world is viable only if it can carry ten distinct physician-facing workflows and if each workflow can force one real decision. The shared chart should provide raw material, not the answer. The task-level file should create the forced slot. The model should fail because it over-trusts a structured document, closes an open item, or misses an off-text contradiction.</w:t>
+              <w:t>A world is viable only if it can carry ten distinct physician-facing workflows and if each workflow can force one real decision. The shared chart should provide raw material, not the answer. The task-level file should create the forced slot. The realistic pitfall is over-trusting a structured document, closing an open item, or missing an off-text contradiction.</w:t>
             </w:r>
           </w:p>
           <w:p>
@@ -656,7 +656,7 @@
                 <w:color w:val="111827"/>
                 <w:sz w:val="17"/>
               </w:rPr>
-              <w:t>The best one is the cardiorenal respiratory transition world. It is common enough to be fair and broad enough to support payer appeals, medication reconciliation, DME status, utilization review, quality abstraction, safety review, and specialist follow-up. The failure axis is readiness under contradiction, which matches the evidence from KM and OV.</w:t>
+              <w:t>The best one is the cardiorenal respiratory transition world. It is common enough to be fair and broad enough to support payer appeals, medication reconciliation, DME status, utilization review, quality abstraction, safety review, and specialist follow-up. The central axis is readiness under contradiction.</w:t>
             </w:r>
           </w:p>
         </w:tc>
@@ -734,7 +734,7 @@
                 <w:color w:val="111827"/>
                 <w:sz w:val="17"/>
               </w:rPr>
-              <w:t>We used a woman in OV. Should world three be male for cardiology, or keep the patient female?</w:t>
+              <w:t>Should the patient be male for the cardiology emphasis, or female?</w:t>
             </w:r>
           </w:p>
         </w:tc>
@@ -798,7 +798,7 @@
                 <w:color w:val="111827"/>
                 <w:sz w:val="17"/>
               </w:rPr>
-              <w:t>Cardiovascular disease is common in both men and women, and a female patient is clinically typical for an older heart-failure transition world. A woman also helps us avoid accidentally making the third world feel like a generic cardiology template.</w:t>
+              <w:t>Cardiovascular disease is common in both men and women, and a female patient is clinically typical for an older heart-failure transition world. A woman also helps avoid a generic cardiology feel.</w:t>
             </w:r>
           </w:p>
           <w:p>
@@ -1160,7 +1160,7 @@
                 <w:color w:val="111827"/>
                 <w:sz w:val="17"/>
               </w:rPr>
-              <w:t>It is plausible, memorable, and easy to spell consistently. It does not echo a public figure or the prior worlds. It gives us a stable folder name: worlds/marva-lydell. Once chosen, the repo folder, status docs, build scripts, and future filenames should all use that exact spelling.</w:t>
+              <w:t>It is plausible, memorable, and easy to spell consistently. It does not echo a public figure or a prior case. Once chosen, every reference and filename should use that exact spelling.</w:t>
             </w:r>
           </w:p>
         </w:tc>
@@ -1238,7 +1238,7 @@
                 <w:color w:val="111827"/>
                 <w:sz w:val="17"/>
               </w:rPr>
-              <w:t>Marva Lydell it is. Rename repo and bootstrap brainstorm.</w:t>
+              <w:t>Marva Lydell it is. Lock the identity and start the brainstorm.</w:t>
             </w:r>
           </w:p>
         </w:tc>
@@ -1341,19 +1341,6 @@
                 <w:color w:val="111827"/>
                 <w:sz w:val="17"/>
               </w:rPr>
-              <w:t>World folder: worlds/marva-lydell.</w:t>
-            </w:r>
-          </w:p>
-          <w:p>
-            <w:pPr>
-              <w:spacing w:before="0" w:after="20" w:line="232" w:lineRule="auto"/>
-            </w:pPr>
-            <w:r>
-              <w:rPr>
-                <w:rFonts w:ascii="Courier New" w:hAnsi="Courier New"/>
-                <w:color w:val="111827"/>
-                <w:sz w:val="17"/>
-              </w:rPr>
               <w:t>World thesis: cardiorenal respiratory transition readiness.</w:t>
             </w:r>
           </w:p>
@@ -1380,7 +1367,7 @@
                 <w:color w:val="111827"/>
                 <w:sz w:val="17"/>
               </w:rPr>
-              <w:t>The bootstrap should create the full workflow spine, live audit, planning canvas, status file, and Brainstorm draft, but it should not create world files, task files, goldens, graders, or platform-ready uploads yet.</w:t>
+              <w:t>The brainstorm should lay out the full workflow spine, the planning notes, and the Brainstorm draft, but not the world files, task files, or platform-ready uploads yet.</w:t>
             </w:r>
           </w:p>
         </w:tc>
@@ -2286,7 +2273,7 @@
                 <w:color w:val="111827"/>
                 <w:sz w:val="17"/>
               </w:rPr>
-              <w:t>Each trap has a fair catcher because the contradicting fact exists somewhere in the attached chart or task-level file.</w:t>
+              <w:t>Each trap is fair because the contradicting fact exists somewhere in the attached chart or task-level file.</w:t>
             </w:r>
           </w:p>
         </w:tc>
@@ -2675,7 +2662,7 @@
                 <w:color w:val="111827"/>
                 <w:sz w:val="17"/>
               </w:rPr>
-              <w:t>What mistakes from OV do we have to write into the Brainstorm before this grows?</w:t>
+              <w:t>What mistakes from past work do we have to write into the Brainstorm before this grows?</w:t>
             </w:r>
           </w:p>
         </w:tc>
@@ -2856,7 +2843,7 @@
                 <w:color w:val="111827"/>
                 <w:sz w:val="17"/>
               </w:rPr>
-              <w:t>8. Make the task fair by confirming a catcher path before banking any floor.</w:t>
+              <w:t>8. Make each task fair by confirming the contradicting fact is reachable in the chart before relying on it.</w:t>
             </w:r>
           </w:p>
         </w:tc>
@@ -2934,7 +2921,7 @@
                 <w:color w:val="111827"/>
                 <w:sz w:val="17"/>
               </w:rPr>
-              <w:t>Build the Brainstorm and transcript package from the OV method, but keep provenance clean.</w:t>
+              <w:t>Build the Brainstorm and transcript package, and keep the provenance clean.</w:t>
             </w:r>
           </w:p>
         </w:tc>
@@ -2998,7 +2985,7 @@
                 <w:color w:val="111827"/>
                 <w:sz w:val="17"/>
               </w:rPr>
-              <w:t>I built the Brainstorm markdown and DOCX through the same Mode A clone path used for OV, so the styling matches the approved base and the provenance stays clean.</w:t>
+              <w:t>I built the Brainstorm document so the styling matches the approved template and the provenance stays clean.</w:t>
             </w:r>
           </w:p>
           <w:p>
@@ -3102,7 +3089,7 @@
                 <w:color w:val="111827"/>
                 <w:sz w:val="17"/>
               </w:rPr>
-              <w:t>Now run it through the Sanctum Coach in the veteran path. I want the Coach to assemble it to the brainstorm template and audit it, so the transcript matches the platform process.</w:t>
+              <w:t>Now run it through the Sanctum Coach. I want the Coach to assemble it to the brainstorm template and audit it, so the transcript matches the platform process.</w:t>
             </w:r>
           </w:p>
         </w:tc>
@@ -3192,7 +3179,7 @@
                 <w:color w:val="111827"/>
                 <w:sz w:val="17"/>
               </w:rPr>
-              <w:t>In the Coach I activated the veteran path, named the Brainstorm phase, and handed it the finished brainstorm. It assembled the four elements into the brainstorm template and walked its pre-submission audit. It confirmed the design: ten tasks across nine distinct workflows, at least one P0, task independence with no stacking, fair contradiction traps each tied to a carrying document, and a common-comorbidity case rather than a stack of rare diagnoses. It cross-checked every lane against its list.</w:t>
+              <w:t>In the Coach I named the Brainstorm phase and handed it the finished brainstorm. It assembled the four elements into the brainstorm template and walked its pre-submission audit. It confirmed the design: ten tasks across nine distinct workflows, at least one P0, task independence with no stacking, fair contradiction traps each tied to a carrying document, and a common-comorbidity case rather than a stack of rare diagnoses. It cross-checked every workflow against its list.</w:t>
             </w:r>
           </w:p>
           <w:p>
@@ -3218,7 +3205,7 @@
                 <w:color w:val="111827"/>
                 <w:sz w:val="17"/>
               </w:rPr>
-              <w:t>It added a synthetic MRN, the document date, and a file-kinds preview, and it kept the workflow strings as submitted. The lanes follow your lead's current cut, which the Coach defers to rather than overwrite.</w:t>
+              <w:t>It added a synthetic MRN, the document date, and a file-kinds preview, and it kept the workflow strings as submitted. The workflows follow your lead's current cut, which the Coach defers to rather than overwrite.</w:t>
             </w:r>
           </w:p>
         </w:tc>

</xml_diff>